<commit_message>
Update the GDD and Fable prompt: save and load from the pause menu
Manual save is now any time from the pause menu, load from the pause menu
or title screen, three slots that autosave and manual saves share, and
settings saved separately. Inn rest saving becomes optional. Save format:
JSON, one versioned file per slot.

Co-Authored-By: Claude Opus 5.5 <noreply@anthropic.com>
Claude-Session: https://claude.ai/code/session_01UyXRHNeXmdewm9VsiK8XYm
</commit_message>
<xml_diff>
--- a/docs/Ember_and_Thread_GDD.docx
+++ b/docs/Ember_and_Thread_GDD.docx
@@ -9432,43 +9432,97 @@
           <w:sz w:val="22"/>
           <w:szCs w:val="22"/>
         </w:rPr>
-        <w:t xml:space="preserve">Autosave at key moments: region transitions, completed mends, NPC dialogue completions</w:t>
-      </w:r>
-    </w:p>
-    <w:p>
-      <w:pPr>
-        <w:pStyle w:val="ListParagraph"/>
-        <w:numPr>
-          <w:ilvl w:val="0"/>
-          <w:numId w:val="2"/>
-        </w:numPr>
-        <w:spacing w:after="60"/>
-      </w:pPr>
-      <w:r>
-        <w:rPr>
-          <w:rFonts w:ascii="Georgia" w:cs="Georgia" w:eastAsia="Georgia" w:hAnsi="Georgia"/>
-          <w:sz w:val="22"/>
-          <w:szCs w:val="22"/>
-        </w:rPr>
-        <w:t xml:space="preserve">Manual save at inn rest spots — the act of resting and saving</w:t>
-      </w:r>
-    </w:p>
-    <w:p>
-      <w:pPr>
-        <w:pStyle w:val="ListParagraph"/>
-        <w:numPr>
-          <w:ilvl w:val="0"/>
-          <w:numId w:val="2"/>
-        </w:numPr>
-        <w:spacing w:after="60"/>
-      </w:pPr>
-      <w:r>
-        <w:rPr>
-          <w:rFonts w:ascii="Georgia" w:cs="Georgia" w:eastAsia="Georgia" w:hAnsi="Georgia"/>
-          <w:sz w:val="22"/>
-          <w:szCs w:val="22"/>
-        </w:rPr>
-        <w:t xml:space="preserve">Multiple save slots recommended</w:t>
+        <w:t xml:space="preserve">Autosave at key moments: region transitions, completed mends, NPC dialogue completions, new places discovered</w:t>
+      </w:r>
+    </w:p>
+    <w:p>
+      <w:pPr>
+        <w:pStyle w:val="ListParagraph"/>
+        <w:numPr>
+          <w:ilvl w:val="0"/>
+          <w:numId w:val="2"/>
+        </w:numPr>
+        <w:spacing w:after="60"/>
+      </w:pPr>
+      <w:r>
+        <w:rPr>
+          <w:rFonts w:ascii="Georgia" w:cs="Georgia" w:eastAsia="Georgia" w:hAnsi="Georgia"/>
+          <w:sz w:val="22"/>
+          <w:szCs w:val="22"/>
+        </w:rPr>
+        <w:t xml:space="preserve">Manual save at any time from the pause menu</w:t>
+      </w:r>
+    </w:p>
+    <w:p>
+      <w:pPr>
+        <w:pStyle w:val="ListParagraph"/>
+        <w:numPr>
+          <w:ilvl w:val="0"/>
+          <w:numId w:val="2"/>
+        </w:numPr>
+        <w:spacing w:after="60"/>
+      </w:pPr>
+      <w:r>
+        <w:rPr>
+          <w:rFonts w:ascii="Georgia" w:cs="Georgia" w:eastAsia="Georgia" w:hAnsi="Georgia"/>
+          <w:sz w:val="22"/>
+          <w:szCs w:val="22"/>
+        </w:rPr>
+        <w:t xml:space="preserve">Load from the pause menu (with a reminder that anything since the last save will be lost) or from the title screen</w:t>
+      </w:r>
+    </w:p>
+    <w:p>
+      <w:pPr>
+        <w:pStyle w:val="ListParagraph"/>
+        <w:numPr>
+          <w:ilvl w:val="0"/>
+          <w:numId w:val="2"/>
+        </w:numPr>
+        <w:spacing w:after="60"/>
+      </w:pPr>
+      <w:r>
+        <w:rPr>
+          <w:rFonts w:ascii="Georgia" w:cs="Georgia" w:eastAsia="Georgia" w:hAnsi="Georgia"/>
+          <w:sz w:val="22"/>
+          <w:szCs w:val="22"/>
+        </w:rPr>
+        <w:t xml:space="preserve">Optional: resting at an inn also saves, as a quiet moment in the world</w:t>
+      </w:r>
+    </w:p>
+    <w:p>
+      <w:pPr>
+        <w:pStyle w:val="ListParagraph"/>
+        <w:numPr>
+          <w:ilvl w:val="0"/>
+          <w:numId w:val="2"/>
+        </w:numPr>
+        <w:spacing w:after="60"/>
+      </w:pPr>
+      <w:r>
+        <w:rPr>
+          <w:rFonts w:ascii="Georgia" w:cs="Georgia" w:eastAsia="Georgia" w:hAnsi="Georgia"/>
+          <w:sz w:val="22"/>
+          <w:szCs w:val="22"/>
+        </w:rPr>
+        <w:t xml:space="preserve">Three save slots; autosaves and manual saves write to the current slot</w:t>
+      </w:r>
+    </w:p>
+    <w:p>
+      <w:pPr>
+        <w:pStyle w:val="ListParagraph"/>
+        <w:numPr>
+          <w:ilvl w:val="0"/>
+          <w:numId w:val="2"/>
+        </w:numPr>
+        <w:spacing w:after="60"/>
+      </w:pPr>
+      <w:r>
+        <w:rPr>
+          <w:rFonts w:ascii="Georgia" w:cs="Georgia" w:eastAsia="Georgia" w:hAnsi="Georgia"/>
+          <w:sz w:val="22"/>
+          <w:szCs w:val="22"/>
+        </w:rPr>
+        <w:t xml:space="preserve">Settings are saved separately from save slots and apply to every playthrough</w:t>
       </w:r>
     </w:p>
     <w:p>
@@ -11511,7 +11565,7 @@
                 <w:sz w:val="20"/>
                 <w:szCs w:val="20"/>
               </w:rPr>
-              <w:t xml:space="preserve">Godot's built-in save system — JSON or binary</w:t>
+              <w:t xml:space="preserve">JSON, one file per save slot, versioned so older saves upgrade</w:t>
             </w:r>
           </w:p>
         </w:tc>
@@ -12164,43 +12218,79 @@
           <w:sz w:val="22"/>
           <w:szCs w:val="22"/>
         </w:rPr>
-        <w:t xml:space="preserve">Autosave triggers: region transitions, mending completions, NPC dialogue completions</w:t>
-      </w:r>
-    </w:p>
-    <w:p>
-      <w:pPr>
-        <w:pStyle w:val="ListParagraph"/>
-        <w:numPr>
-          <w:ilvl w:val="0"/>
-          <w:numId w:val="2"/>
-        </w:numPr>
-        <w:spacing w:after="60"/>
-      </w:pPr>
-      <w:r>
-        <w:rPr>
-          <w:rFonts w:ascii="Georgia" w:cs="Georgia" w:eastAsia="Georgia" w:hAnsi="Georgia"/>
-          <w:sz w:val="22"/>
-          <w:szCs w:val="22"/>
-        </w:rPr>
-        <w:t xml:space="preserve">Manual save: inn rest interaction</w:t>
-      </w:r>
-    </w:p>
-    <w:p>
-      <w:pPr>
-        <w:pStyle w:val="ListParagraph"/>
-        <w:numPr>
-          <w:ilvl w:val="0"/>
-          <w:numId w:val="2"/>
-        </w:numPr>
-        <w:spacing w:after="60"/>
-      </w:pPr>
-      <w:r>
-        <w:rPr>
-          <w:rFonts w:ascii="Georgia" w:cs="Georgia" w:eastAsia="Georgia" w:hAnsi="Georgia"/>
-          <w:sz w:val="22"/>
-          <w:szCs w:val="22"/>
-        </w:rPr>
-        <w:t xml:space="preserve">Save data: world state, NPC visit counts, journal state, comfort items, map reveal, customisation</w:t>
+        <w:t xml:space="preserve">Autosave triggers: region transitions, mending completions, NPC dialogue completions, location discoveries</w:t>
+      </w:r>
+    </w:p>
+    <w:p>
+      <w:pPr>
+        <w:pStyle w:val="ListParagraph"/>
+        <w:numPr>
+          <w:ilvl w:val="0"/>
+          <w:numId w:val="2"/>
+        </w:numPr>
+        <w:spacing w:after="60"/>
+      </w:pPr>
+      <w:r>
+        <w:rPr>
+          <w:rFonts w:ascii="Georgia" w:cs="Georgia" w:eastAsia="Georgia" w:hAnsi="Georgia"/>
+          <w:sz w:val="22"/>
+          <w:szCs w:val="22"/>
+        </w:rPr>
+        <w:t xml:space="preserve">Manual save: pause menu, any time; optionally the inn rest interaction</w:t>
+      </w:r>
+    </w:p>
+    <w:p>
+      <w:pPr>
+        <w:pStyle w:val="ListParagraph"/>
+        <w:numPr>
+          <w:ilvl w:val="0"/>
+          <w:numId w:val="2"/>
+        </w:numPr>
+        <w:spacing w:after="60"/>
+      </w:pPr>
+      <w:r>
+        <w:rPr>
+          <w:rFonts w:ascii="Georgia" w:cs="Georgia" w:eastAsia="Georgia" w:hAnsi="Georgia"/>
+          <w:sz w:val="22"/>
+          <w:szCs w:val="22"/>
+        </w:rPr>
+        <w:t xml:space="preserve">Load: pause menu and title screen</w:t>
+      </w:r>
+    </w:p>
+    <w:p>
+      <w:pPr>
+        <w:pStyle w:val="ListParagraph"/>
+        <w:numPr>
+          <w:ilvl w:val="0"/>
+          <w:numId w:val="2"/>
+        </w:numPr>
+        <w:spacing w:after="60"/>
+      </w:pPr>
+      <w:r>
+        <w:rPr>
+          <w:rFonts w:ascii="Georgia" w:cs="Georgia" w:eastAsia="Georgia" w:hAnsi="Georgia"/>
+          <w:sz w:val="22"/>
+          <w:szCs w:val="22"/>
+        </w:rPr>
+        <w:t xml:space="preserve">Save data: world state, player position, location discoveries, NPC visit counts, journal state, comfort items, map reveal, customisation</w:t>
+      </w:r>
+    </w:p>
+    <w:p>
+      <w:pPr>
+        <w:pStyle w:val="ListParagraph"/>
+        <w:numPr>
+          <w:ilvl w:val="0"/>
+          <w:numId w:val="2"/>
+        </w:numPr>
+        <w:spacing w:after="60"/>
+      </w:pPr>
+      <w:r>
+        <w:rPr>
+          <w:rFonts w:ascii="Georgia" w:cs="Georgia" w:eastAsia="Georgia" w:hAnsi="Georgia"/>
+          <w:sz w:val="22"/>
+          <w:szCs w:val="22"/>
+        </w:rPr>
+        <w:t xml:space="preserve">Settings (accessibility options) stored in their own file, not in save slots</w:t>
       </w:r>
     </w:p>
     <w:p>

</xml_diff>

<commit_message>
Plan: per-slot settings, title and slot screens, no save on quit, cutscene skip
- Each save slot is one player: progress plus their own settings, kept in
  slot_N.settings.cfg so a settings change persists even though quitting
  doesn't save. Title and slot screens use the last player's settings.
- Title screen is the art and 'press any button'; the slot screen then
  continues a saved slot or starts a new game in an empty one.
- Quit to Title never saves and asks first; autosave stays, with a save
  icon in the lower right corner.
- New game is a brand new player, then the opening cutscene; a reusable
  cutscene component with a two-press skip (E, then E again).

GDD and Fable prompt updated to match.

Co-Authored-By: Claude Opus 5.5 <noreply@anthropic.com>
Claude-Session: https://claude.ai/code/session_01UyXRHNeXmdewm9VsiK8XYm
</commit_message>
<xml_diff>
--- a/docs/Ember_and_Thread_GDD.docx
+++ b/docs/Ember_and_Thread_GDD.docx
@@ -6373,6 +6373,24 @@
           <w:szCs w:val="22"/>
         </w:rPr>
         <w:t xml:space="preserve">Length: brief — enough to feel meaningful, not so long as to feel like a lecture</w:t>
+      </w:r>
+    </w:p>
+    <w:p>
+      <w:pPr>
+        <w:pStyle w:val="ListParagraph"/>
+        <w:numPr>
+          <w:ilvl w:val="0"/>
+          <w:numId w:val="2"/>
+        </w:numPr>
+        <w:spacing w:after="60"/>
+      </w:pPr>
+      <w:r>
+        <w:rPr>
+          <w:rFonts w:ascii="Georgia" w:cs="Georgia" w:eastAsia="Georgia" w:hAnsi="Georgia"/>
+          <w:sz w:val="22"/>
+          <w:szCs w:val="22"/>
+        </w:rPr>
+        <w:t xml:space="preserve">Skippable: the first press of E shows “Press E again to skip”, the second press skips — two presses rather than a hold, which is hard for some players, and no time limit on either</w:t>
       </w:r>
     </w:p>
     <w:p>
@@ -9432,7 +9450,7 @@
           <w:sz w:val="22"/>
           <w:szCs w:val="22"/>
         </w:rPr>
-        <w:t xml:space="preserve">Autosave at key moments: region transitions, completed mends, NPC dialogue completions, new places discovered</w:t>
+        <w:t xml:space="preserve">Autosave at key moments: region transitions, completed mends, NPC dialogue completions, new places discovered — shown by a save icon in the lower right corner</w:t>
       </w:r>
     </w:p>
     <w:p>
@@ -9468,7 +9486,25 @@
           <w:sz w:val="22"/>
           <w:szCs w:val="22"/>
         </w:rPr>
-        <w:t xml:space="preserve">Load from the pause menu (with a reminder that anything since the last save will be lost) or from the title screen</w:t>
+        <w:t xml:space="preserve">Load from the pause menu (with a reminder that anything since the last save will be lost) or from the slot screen</w:t>
+      </w:r>
+    </w:p>
+    <w:p>
+      <w:pPr>
+        <w:pStyle w:val="ListParagraph"/>
+        <w:numPr>
+          <w:ilvl w:val="0"/>
+          <w:numId w:val="2"/>
+        </w:numPr>
+        <w:spacing w:after="60"/>
+      </w:pPr>
+      <w:r>
+        <w:rPr>
+          <w:rFonts w:ascii="Georgia" w:cs="Georgia" w:eastAsia="Georgia" w:hAnsi="Georgia"/>
+          <w:sz w:val="22"/>
+          <w:szCs w:val="22"/>
+        </w:rPr>
+        <w:t xml:space="preserve">Quitting never saves — to the title or the desktop. The game asks first, so nobody loses progress by surprise</w:t>
       </w:r>
     </w:p>
     <w:p>
@@ -9522,7 +9558,43 @@
           <w:sz w:val="22"/>
           <w:szCs w:val="22"/>
         </w:rPr>
-        <w:t xml:space="preserve">Settings are saved separately from save slots and apply to every playthrough</w:t>
+        <w:t xml:space="preserve">Opening flow: title screen (title art and “press any button”), then the slot screen — choose a slot with a save to continue it, or an empty slot to start a new game</w:t>
+      </w:r>
+    </w:p>
+    <w:p>
+      <w:pPr>
+        <w:pStyle w:val="ListParagraph"/>
+        <w:numPr>
+          <w:ilvl w:val="0"/>
+          <w:numId w:val="2"/>
+        </w:numPr>
+        <w:spacing w:after="60"/>
+      </w:pPr>
+      <w:r>
+        <w:rPr>
+          <w:rFonts w:ascii="Georgia" w:cs="Georgia" w:eastAsia="Georgia" w:hAnsi="Georgia"/>
+          <w:sz w:val="22"/>
+          <w:szCs w:val="22"/>
+        </w:rPr>
+        <w:t xml:space="preserve">Each save slot is one player: their progress and their own settings, so people sharing a computer keep separate settings</w:t>
+      </w:r>
+    </w:p>
+    <w:p>
+      <w:pPr>
+        <w:pStyle w:val="ListParagraph"/>
+        <w:numPr>
+          <w:ilvl w:val="0"/>
+          <w:numId w:val="2"/>
+        </w:numPr>
+        <w:spacing w:after="60"/>
+      </w:pPr>
+      <w:r>
+        <w:rPr>
+          <w:rFonts w:ascii="Georgia" w:cs="Georgia" w:eastAsia="Georgia" w:hAnsi="Georgia"/>
+          <w:sz w:val="22"/>
+          <w:szCs w:val="22"/>
+        </w:rPr>
+        <w:t xml:space="preserve">A new game is a brand new player: fresh progress, then the opening cutscene</w:t>
       </w:r>
     </w:p>
     <w:p>
@@ -11990,7 +12062,7 @@
           <w:sz w:val="22"/>
           <w:szCs w:val="22"/>
         </w:rPr>
-        <w:t xml:space="preserve">Memory cutscene system: scripted pixel art scenes with timed text overlay</w:t>
+        <w:t xml:space="preserve">Memory cutscene system: scripted pixel art scenes with timed text overlay; two-press skip</w:t>
       </w:r>
     </w:p>
     <w:p>
@@ -12254,7 +12326,7 @@
           <w:sz w:val="22"/>
           <w:szCs w:val="22"/>
         </w:rPr>
-        <w:t xml:space="preserve">Load: pause menu and title screen</w:t>
+        <w:t xml:space="preserve">Load: pause menu and slot screen</w:t>
       </w:r>
     </w:p>
     <w:p>
@@ -12290,7 +12362,7 @@
           <w:sz w:val="22"/>
           <w:szCs w:val="22"/>
         </w:rPr>
-        <w:t xml:space="preserve">Settings (accessibility options) stored in their own file, not in save slots</w:t>
+        <w:t xml:space="preserve">Settings (accessibility options) stored per save slot, beside the save file, so a settings change is kept even though quitting doesn’t save progress</w:t>
       </w:r>
     </w:p>
     <w:p>

</xml_diff>